<commit_message>
feat(qa-fixes): resolve itens do relatório de QA
- #8: modal de edição de licitação + botão no detalhe e menu ...
- #9: campos UF (obrigatório) e município (opcional) + migration
- #7/#10: listagem de documentos por licitação já estava OK (validado)
- #4: IA não sobrescreve título + detecção de PDF não-edital +
       dark mode do modal + bloqueio de predição sem edital válido
- #2: fix PDF em produção (puppeteer → @sparticuz/chromium)
- Mailtrap: migração completa do mail.service para SDK Mailtrap
            com sender hello@mail.lvxlicitacao.com.br
- Menu: reorganização (Buscar sem dropdown, ordem corrigida)
- Acessibilidade: FontSizeControl A-/A/A+ no header global
- Cosmético: label tipo de arquivo amigável nos documentos
- Cosmético: badge Beta na Análise Preditiva de Sucesso
- Cosmético: fix layout mobile do header e botões do dashboard

Made-with: Cursor
</commit_message>
<xml_diff>
--- a/apps/api/src/juridico/templates/ESCLARECIMENTO.docx
+++ b/apps/api/src/juridico/templates/ESCLARECIMENTO.docx
@@ -80,7 +80,7 @@
     </w:p>
     <w:p>
       <w:r>
-        <w:t xml:space="preserve">Empresa: Limvex (Sistema)</w:t>
+        <w:t xml:space="preserve">Empresa: Limvex Sistema</w:t>
       </w:r>
     </w:p>
     <w:p>
@@ -108,7 +108,7 @@
     </w:p>
     <w:p>
       <w:r>
-        <w:t xml:space="preserve">Refere-se ao processo licitatório "Aquisição de materiais de consumo (bandeiras e insumos para confecção de crachás) que visam a atender às demandas das Unidades Administrativas do Ministério da Justiça e Segurança Pública." do órgão teste.</w:t>
+        <w:t xml:space="preserve">Refere-se ao processo licitatório "teste" do órgão teste.</w:t>
       </w:r>
     </w:p>
     <w:p>
@@ -126,7 +126,7 @@
     </w:p>
     <w:p>
       <w:r>
-        <w:t xml:space="preserve">fewdgf</w:t>
+        <w:t xml:space="preserve">fgedgg</w:t>
       </w:r>
     </w:p>
     <w:p>
@@ -157,7 +157,7 @@
           <w:sz w:val="20"/>
           <w:szCs w:val="20"/>
         </w:rPr>
-        <w:t xml:space="preserve">Cidade/UF, 04/03/2026</w:t>
+        <w:t xml:space="preserve">Cidade/UF, 06/03/2026</w:t>
       </w:r>
     </w:p>
     <w:p>
@@ -174,7 +174,7 @@
           <w:sz w:val="22"/>
           <w:szCs w:val="22"/>
         </w:rPr>
-        <w:t xml:space="preserve">Limvex (Sistema)</w:t>
+        <w:t xml:space="preserve">Limvex Sistema</w:t>
       </w:r>
     </w:p>
     <w:p>
@@ -252,7 +252,7 @@
           <w:sz w:val="14"/>
           <w:szCs w:val="14"/>
         </w:rPr>
-        <w:t xml:space="preserve">38D537F6A55F7865</w:t>
+        <w:t xml:space="preserve">3677D870B519108D</w:t>
       </w:r>
     </w:p>
     <w:p>
@@ -263,7 +263,7 @@
           <w:sz w:val="14"/>
           <w:szCs w:val="14"/>
         </w:rPr>
-        <w:t xml:space="preserve">Verifique em: http://localhost:3000/verificar/38D537F6A55F7865</w:t>
+        <w:t xml:space="preserve">Verifique em: http://localhost:3000/verificar/3677D870B519108D</w:t>
       </w:r>
     </w:p>
     <w:p>
@@ -274,7 +274,7 @@
           <w:sz w:val="14"/>
           <w:szCs w:val="14"/>
         </w:rPr>
-        <w:t xml:space="preserve">Gerado em: 04/03/2026, 18:05:25</w:t>
+        <w:t xml:space="preserve">Gerado em: 06/03/2026, 09:50:16</w:t>
       </w:r>
     </w:p>
     <w:sectPr>

</xml_diff>